<commit_message>
Equal distribution policy update
</commit_message>
<xml_diff>
--- a/Software_Project_Template/02_Governance_and_Equity/First_Earnings_Equal_Distribution.docx
+++ b/Software_Project_Template/02_Governance_and_Equity/First_Earnings_Equal_Distribution.docx
@@ -19,7 +19,7 @@
     </w:p>
     <w:p>
       <w:r>
-        <w:pict>
+        <w:pict w14:anchorId="15E32ECA">
           <v:rect id="_x0000_i1025" style="width:0;height:1.5pt" o:hralign="center" o:hrstd="t" o:hr="t" fillcolor="#a0a0a0" stroked="f"/>
         </w:pict>
       </w:r>
@@ -100,7 +100,7 @@
     </w:p>
     <w:p>
       <w:r>
-        <w:pict>
+        <w:pict w14:anchorId="4786B65A">
           <v:rect id="_x0000_i1026" style="width:0;height:1.5pt" o:hralign="center" o:hrstd="t" o:hr="t" fillcolor="#a0a0a0" stroked="f"/>
         </w:pict>
       </w:r>
@@ -230,7 +230,7 @@
     </w:p>
     <w:p>
       <w:r>
-        <w:pict>
+        <w:pict w14:anchorId="160E72AA">
           <v:rect id="_x0000_i1027" style="width:0;height:1.5pt" o:hralign="center" o:hrstd="t" o:hr="t" fillcolor="#a0a0a0" stroked="f"/>
         </w:pict>
       </w:r>
@@ -257,12 +257,30 @@
     </w:p>
     <w:p>
       <w:r>
-        <w:t>Equally among all Active Contributors at the time of payout.</w:t>
-      </w:r>
-    </w:p>
-    <w:p>
-      <w:r>
-        <w:t>Active Contributor = Contributor who:</w:t>
+        <w:t xml:space="preserve">Equally among all Active </w:t>
+      </w:r>
+      <w:r>
+        <w:t>Participants</w:t>
+      </w:r>
+      <w:r>
+        <w:t xml:space="preserve"> at the time of payout.</w:t>
+      </w:r>
+    </w:p>
+    <w:p>
+      <w:r>
+        <w:t xml:space="preserve">Active </w:t>
+      </w:r>
+      <w:r>
+        <w:t>Participants</w:t>
+      </w:r>
+      <w:r>
+        <w:t xml:space="preserve"> = </w:t>
+      </w:r>
+      <w:r>
+        <w:t>Participants</w:t>
+      </w:r>
+      <w:r>
+        <w:t xml:space="preserve"> who:</w:t>
       </w:r>
     </w:p>
     <w:p>
@@ -311,7 +329,7 @@
     </w:p>
     <w:p>
       <w:r>
-        <w:pict>
+        <w:pict w14:anchorId="4351A0AD">
           <v:rect id="_x0000_i1028" style="width:0;height:1.5pt" o:hralign="center" o:hrstd="t" o:hr="t" fillcolor="#a0a0a0" stroked="f"/>
         </w:pict>
       </w:r>
@@ -387,7 +405,7 @@
     </w:p>
     <w:p>
       <w:r>
-        <w:pict>
+        <w:pict w14:anchorId="2D8DDA2D">
           <v:rect id="_x0000_i1029" style="width:0;height:1.5pt" o:hralign="center" o:hrstd="t" o:hr="t" fillcolor="#a0a0a0" stroked="f"/>
         </w:pict>
       </w:r>
@@ -413,7 +431,13 @@
       </w:r>
       <w:r>
         <w:br/>
-        <w:t>Active contributors = 5</w:t>
+        <w:t xml:space="preserve">Active </w:t>
+      </w:r>
+      <w:r>
+        <w:t>participant</w:t>
+      </w:r>
+      <w:r>
+        <w:t>s = 5</w:t>
       </w:r>
     </w:p>
     <w:p>
@@ -433,7 +457,7 @@
     </w:p>
     <w:p>
       <w:r>
-        <w:pict>
+        <w:pict w14:anchorId="35F7B535">
           <v:rect id="_x0000_i1030" style="width:0;height:1.5pt" o:hralign="center" o:hrstd="t" o:hr="t" fillcolor="#a0a0a0" stroked="f"/>
         </w:pict>
       </w:r>
@@ -455,7 +479,10 @@
     </w:p>
     <w:p>
       <w:r>
-        <w:t>Contributors classified under:</w:t>
+        <w:t>Participants</w:t>
+      </w:r>
+      <w:r>
+        <w:t xml:space="preserve"> classified under:</w:t>
       </w:r>
     </w:p>
     <w:p>
@@ -481,7 +508,7 @@
     </w:p>
     <w:p>
       <w:r>
-        <w:pict>
+        <w:pict w14:anchorId="7AEF8951">
           <v:rect id="_x0000_i1031" style="width:0;height:1.5pt" o:hralign="center" o:hrstd="t" o:hr="t" fillcolor="#a0a0a0" stroked="f"/>
         </w:pict>
       </w:r>
@@ -542,7 +569,7 @@
     </w:p>
     <w:p>
       <w:r>
-        <w:pict>
+        <w:pict w14:anchorId="5273EB2D">
           <v:rect id="_x0000_i1032" style="width:0;height:1.5pt" o:hralign="center" o:hrstd="t" o:hr="t" fillcolor="#a0a0a0" stroked="f"/>
         </w:pict>
       </w:r>
@@ -632,8 +659,8 @@
     </w:p>
     <w:p>
       <w:r>
-        <w:pict>
-          <v:rect id="_x0000_i1075" style="width:0;height:1.5pt" o:hralign="center" o:hrstd="t" o:hr="t" fillcolor="#a0a0a0" stroked="f"/>
+        <w:pict w14:anchorId="4411F5D7">
+          <v:rect id="_x0000_i1033" style="width:0;height:1.5pt" o:hralign="center" o:hrstd="t" o:hr="t" fillcolor="#a0a0a0" stroked="f"/>
         </w:pict>
       </w:r>
     </w:p>
@@ -661,15 +688,7 @@
     </w:p>
     <w:p>
       <w:r>
-        <w:t xml:space="preserve">Pre-Earnings refers to income received by the </w:t>
-      </w:r>
-      <w:proofErr w:type="spellStart"/>
-      <w:r>
-        <w:t>Ideator</w:t>
-      </w:r>
-      <w:proofErr w:type="spellEnd"/>
-      <w:r>
-        <w:t xml:space="preserve"> (or any individual contributor) that:</w:t>
+        <w:t>Pre-Earnings refers to income received by the Ideator (or any individual contributor) that:</w:t>
       </w:r>
     </w:p>
     <w:p>
@@ -751,13 +770,8 @@
         </w:numPr>
       </w:pPr>
       <w:r>
-        <w:t xml:space="preserve">Advisory retainer paid directly to </w:t>
-      </w:r>
-      <w:proofErr w:type="spellStart"/>
-      <w:r>
-        <w:t>Ideator</w:t>
-      </w:r>
-      <w:proofErr w:type="spellEnd"/>
+        <w:t>Advisory retainer paid directly to Ideator</w:t>
+      </w:r>
     </w:p>
     <w:p>
       <w:pPr>
@@ -783,8 +797,8 @@
     </w:p>
     <w:p>
       <w:r>
-        <w:pict>
-          <v:rect id="_x0000_i1076" style="width:0;height:1.5pt" o:hralign="center" o:hrstd="t" o:hr="t" fillcolor="#a0a0a0" stroked="f"/>
+        <w:pict w14:anchorId="00110071">
+          <v:rect id="_x0000_i1034" style="width:0;height:1.5pt" o:hralign="center" o:hrstd="t" o:hr="t" fillcolor="#a0a0a0" stroked="f"/>
         </w:pict>
       </w:r>
     </w:p>
@@ -883,8 +897,8 @@
     </w:p>
     <w:p>
       <w:r>
-        <w:pict>
-          <v:rect id="_x0000_i1077" style="width:0;height:1.5pt" o:hralign="center" o:hrstd="t" o:hr="t" fillcolor="#a0a0a0" stroked="f"/>
+        <w:pict w14:anchorId="274A9F88">
+          <v:rect id="_x0000_i1035" style="width:0;height:1.5pt" o:hralign="center" o:hrstd="t" o:hr="t" fillcolor="#a0a0a0" stroked="f"/>
         </w:pict>
       </w:r>
     </w:p>
@@ -973,8 +987,8 @@
     </w:p>
     <w:p>
       <w:r>
-        <w:pict>
-          <v:rect id="_x0000_i1078" style="width:0;height:1.5pt" o:hralign="center" o:hrstd="t" o:hr="t" fillcolor="#a0a0a0" stroked="f"/>
+        <w:pict w14:anchorId="74D6EBE3">
+          <v:rect id="_x0000_i1036" style="width:0;height:1.5pt" o:hralign="center" o:hrstd="t" o:hr="t" fillcolor="#a0a0a0" stroked="f"/>
         </w:pict>
       </w:r>
     </w:p>
@@ -1047,8 +1061,8 @@
     </w:p>
     <w:p>
       <w:r>
-        <w:pict>
-          <v:rect id="_x0000_i1079" style="width:0;height:1.5pt" o:hralign="center" o:hrstd="t" o:hr="t" fillcolor="#a0a0a0" stroked="f"/>
+        <w:pict w14:anchorId="742455E1">
+          <v:rect id="_x0000_i1037" style="width:0;height:1.5pt" o:hralign="center" o:hrstd="t" o:hr="t" fillcolor="#a0a0a0" stroked="f"/>
         </w:pict>
       </w:r>
     </w:p>
@@ -1097,13 +1111,8 @@
       </w:r>
     </w:p>
     <w:p>
-      <w:proofErr w:type="spellStart"/>
-      <w:r>
-        <w:t>Ideator</w:t>
-      </w:r>
-      <w:proofErr w:type="spellEnd"/>
-      <w:r>
-        <w:t xml:space="preserve"> receives:</w:t>
+      <w:r>
+        <w:t>Ideator receives:</w:t>
       </w:r>
     </w:p>
     <w:p>
@@ -1149,8 +1158,8 @@
     </w:p>
     <w:p>
       <w:r>
-        <w:pict>
-          <v:rect id="_x0000_i1080" style="width:0;height:1.5pt" o:hralign="center" o:hrstd="t" o:hr="t" fillcolor="#a0a0a0" stroked="f"/>
+        <w:pict w14:anchorId="30FF80AA">
+          <v:rect id="_x0000_i1038" style="width:0;height:1.5pt" o:hralign="center" o:hrstd="t" o:hr="t" fillcolor="#a0a0a0" stroked="f"/>
         </w:pict>
       </w:r>
     </w:p>
@@ -1193,8 +1202,8 @@
     </w:p>
     <w:p>
       <w:r>
-        <w:pict>
-          <v:rect id="_x0000_i1081" style="width:0;height:1.5pt" o:hralign="center" o:hrstd="t" o:hr="t" fillcolor="#a0a0a0" stroked="f"/>
+        <w:pict w14:anchorId="54F7D133">
+          <v:rect id="_x0000_i1039" style="width:0;height:1.5pt" o:hralign="center" o:hrstd="t" o:hr="t" fillcolor="#a0a0a0" stroked="f"/>
         </w:pict>
       </w:r>
     </w:p>
@@ -1267,23 +1276,11 @@
     </w:p>
     <w:p>
       <w:r>
-        <w:t xml:space="preserve">Equal distribution </w:t>
-      </w:r>
-      <w:r>
-        <w:t>honours</w:t>
-      </w:r>
-      <w:r>
-        <w:t xml:space="preserve"> collective build.</w:t>
+        <w:t>Equal distribution honours collective build.</w:t>
       </w:r>
       <w:r>
         <w:br/>
-        <w:t xml:space="preserve">Pre-Earnings </w:t>
-      </w:r>
-      <w:r>
-        <w:t>honour</w:t>
-      </w:r>
-      <w:r>
-        <w:t xml:space="preserve"> individual initiative.</w:t>
+        <w:t>Pre-Earnings honour individual initiative.</w:t>
       </w:r>
     </w:p>
     <w:p/>
@@ -4034,6 +4031,7 @@
   <w:style w:type="character" w:default="1" w:styleId="DefaultParagraphFont">
     <w:name w:val="Default Paragraph Font"/>
     <w:uiPriority w:val="1"/>
+    <w:semiHidden/>
     <w:unhideWhenUsed/>
   </w:style>
   <w:style w:type="table" w:default="1" w:styleId="TableNormal">

</xml_diff>